<commit_message>
Actualizacion del manual de mantenimiento y plan de mejoras
</commit_message>
<xml_diff>
--- a/TP2. E15 Registro de Mantenimiento y Plan de Mejoras Futuras TANI.docx
+++ b/TP2. E15 Registro de Mantenimiento y Plan de Mejoras Futuras TANI.docx
@@ -158,8 +158,8 @@
       </w:tblPr>
       <w:tblGrid>
         <w:gridCol w:w="830"/>
-        <w:gridCol w:w="1388"/>
-        <w:gridCol w:w="4660"/>
+        <w:gridCol w:w="1374"/>
+        <w:gridCol w:w="4674"/>
         <w:gridCol w:w="1616"/>
       </w:tblGrid>
       <w:tr>
@@ -449,7 +449,10 @@
             </w:r>
             <w:proofErr w:type="spellEnd"/>
             <w:r>
-              <w:t xml:space="preserve"> de biólogos (Token JWT inválido)</w:t>
+              <w:t xml:space="preserve"> de</w:t>
+            </w:r>
+            <w:r>
+              <w:t>l personal del banco de leche</w:t>
             </w:r>
           </w:p>
         </w:tc>
@@ -562,14 +565,13 @@
               </w:rPr>
             </w:pPr>
             <w:r>
-              <w:t xml:space="preserve">Actualización de librerías </w:t>
+              <w:t>Actualización de librerías</w:t>
+            </w:r>
+            <w:r>
+              <w:t xml:space="preserve"> </w:t>
             </w:r>
             <w:proofErr w:type="spellStart"/>
             <w:r>
-              <w:rPr>
-                <w:rStyle w:val="CdigoHTML"/>
-                <w:rFonts w:eastAsiaTheme="minorHAnsi"/>
-              </w:rPr>
               <w:t>npm</w:t>
             </w:r>
             <w:proofErr w:type="spellEnd"/>
@@ -678,7 +680,15 @@
               </w:rPr>
             </w:pPr>
             <w:r>
-              <w:t>Reinicio de servicio PostgreSQL por latencia en consultas de stock</w:t>
+              <w:t xml:space="preserve">Reinicio de servicio </w:t>
+            </w:r>
+            <w:proofErr w:type="spellStart"/>
+            <w:r>
+              <w:t>MySql</w:t>
+            </w:r>
+            <w:proofErr w:type="spellEnd"/>
+            <w:r>
+              <w:t xml:space="preserve"> por latencia en consultas de stock</w:t>
             </w:r>
           </w:p>
         </w:tc>
@@ -784,6 +794,9 @@
             </w:pPr>
             <w:r>
               <w:t>Auditoría de seguridad en datos sensibles de donantes</w:t>
+            </w:r>
+            <w:r>
+              <w:t xml:space="preserve"> internas y externas</w:t>
             </w:r>
           </w:p>
         </w:tc>
@@ -1036,10 +1049,10 @@
         <w:tblLook w:val="04A0" w:firstRow="1" w:lastRow="0" w:firstColumn="1" w:lastColumn="0" w:noHBand="0" w:noVBand="1"/>
       </w:tblPr>
       <w:tblGrid>
-        <w:gridCol w:w="2324"/>
-        <w:gridCol w:w="3657"/>
+        <w:gridCol w:w="2344"/>
+        <w:gridCol w:w="3630"/>
         <w:gridCol w:w="1216"/>
-        <w:gridCol w:w="1297"/>
+        <w:gridCol w:w="1304"/>
       </w:tblGrid>
       <w:tr>
         <w:trPr>
@@ -1355,23 +1368,7 @@
                 <w:rFonts w:ascii="Times New Roman" w:eastAsia="Times New Roman" w:hAnsi="Times New Roman" w:cs="Times New Roman"/>
                 <w:lang w:eastAsia="es-PE"/>
               </w:rPr>
-              <w:t xml:space="preserve"> Notificaciones automáticas (Email/</w:t>
-            </w:r>
-            <w:proofErr w:type="spellStart"/>
-            <w:r>
-              <w:rPr>
-                <w:rFonts w:ascii="Times New Roman" w:eastAsia="Times New Roman" w:hAnsi="Times New Roman" w:cs="Times New Roman"/>
-                <w:lang w:eastAsia="es-PE"/>
-              </w:rPr>
-              <w:t>Dashboard</w:t>
-            </w:r>
-            <w:proofErr w:type="spellEnd"/>
-            <w:r>
-              <w:rPr>
-                <w:rFonts w:ascii="Times New Roman" w:eastAsia="Times New Roman" w:hAnsi="Times New Roman" w:cs="Times New Roman"/>
-                <w:lang w:eastAsia="es-PE"/>
-              </w:rPr>
-              <w:t>) 3 días antes de que la leche cruda o pasteurizada venza.</w:t>
+              <w:t xml:space="preserve"> Notificaciones automáticas 3 días antes de que la leche cruda o pasteurizada venza.</w:t>
             </w:r>
           </w:p>
         </w:tc>
@@ -1482,23 +1479,14 @@
                 <w:rFonts w:ascii="Times New Roman" w:eastAsia="Times New Roman" w:hAnsi="Times New Roman" w:cs="Times New Roman"/>
                 <w:lang w:eastAsia="es-PE"/>
               </w:rPr>
-              <w:t xml:space="preserve"> Servicios de firma electrónica (ej. </w:t>
-            </w:r>
-            <w:proofErr w:type="spellStart"/>
+              <w:t xml:space="preserve"> Servicios de firma electrónica</w:t>
+            </w:r>
             <w:r>
               <w:rPr>
                 <w:rFonts w:ascii="Times New Roman" w:eastAsia="Times New Roman" w:hAnsi="Times New Roman" w:cs="Times New Roman"/>
                 <w:lang w:eastAsia="es-PE"/>
               </w:rPr>
-              <w:t>indecopi</w:t>
-            </w:r>
-            <w:proofErr w:type="spellEnd"/>
-            <w:r>
-              <w:rPr>
-                <w:rFonts w:ascii="Times New Roman" w:eastAsia="Times New Roman" w:hAnsi="Times New Roman" w:cs="Times New Roman"/>
-                <w:lang w:eastAsia="es-PE"/>
-              </w:rPr>
-              <w:t>/privados).</w:t>
+              <w:t>.</w:t>
             </w:r>
           </w:p>
           <w:p>
@@ -1540,7 +1528,7 @@
                 <w:rFonts w:ascii="Times New Roman" w:eastAsia="Times New Roman" w:hAnsi="Times New Roman" w:cs="Times New Roman"/>
                 <w:lang w:eastAsia="es-PE"/>
               </w:rPr>
-              <w:t xml:space="preserve"> o celular, almacenando el PDF firmado automáticamente.</w:t>
+              <w:t>, almacenando el PDF firmado automáticamente.</w:t>
             </w:r>
           </w:p>
         </w:tc>
@@ -1742,7 +1730,6 @@
               <w:rPr>
                 <w:lang w:eastAsia="es-PE"/>
               </w:rPr>
-              <w:lastRenderedPageBreak/>
               <w:t>Panel de administración</w:t>
             </w:r>
           </w:p>
@@ -1837,6 +1824,7 @@
               <w:rPr>
                 <w:lang w:eastAsia="es-PE"/>
               </w:rPr>
+              <w:lastRenderedPageBreak/>
               <w:t>Recordatorios por email</w:t>
             </w:r>
           </w:p>
@@ -1860,6 +1848,8 @@
               </w:rPr>
               <w:t>Notificaciones automáticas de vencimiento de tareas</w:t>
             </w:r>
+            <w:bookmarkStart w:id="0" w:name="_GoBack"/>
+            <w:bookmarkEnd w:id="0"/>
           </w:p>
         </w:tc>
         <w:tc>
@@ -1928,37 +1918,12 @@
           <w:lang w:eastAsia="es-PE"/>
         </w:rPr>
       </w:pPr>
-      <w:proofErr w:type="spellStart"/>
-      <w:r>
-        <w:rPr>
-          <w:rFonts w:ascii="Times New Roman" w:eastAsia="Times New Roman" w:hAnsi="Times New Roman" w:cs="Times New Roman"/>
-          <w:lang w:eastAsia="es-PE"/>
-        </w:rPr>
-        <w:t>Backups</w:t>
-      </w:r>
-      <w:proofErr w:type="spellEnd"/>
-      <w:r>
-        <w:rPr>
-          <w:rFonts w:ascii="Times New Roman" w:eastAsia="Times New Roman" w:hAnsi="Times New Roman" w:cs="Times New Roman"/>
-          <w:lang w:eastAsia="es-PE"/>
-        </w:rPr>
-        <w:t xml:space="preserve"> automáticos de la BD (diarios a las 00:00 </w:t>
-      </w:r>
-      <w:proofErr w:type="spellStart"/>
-      <w:r>
-        <w:rPr>
-          <w:rFonts w:ascii="Times New Roman" w:eastAsia="Times New Roman" w:hAnsi="Times New Roman" w:cs="Times New Roman"/>
-          <w:lang w:eastAsia="es-PE"/>
-        </w:rPr>
-        <w:t>hrs</w:t>
-      </w:r>
-      <w:proofErr w:type="spellEnd"/>
-      <w:r>
-        <w:rPr>
-          <w:rFonts w:ascii="Times New Roman" w:eastAsia="Times New Roman" w:hAnsi="Times New Roman" w:cs="Times New Roman"/>
-          <w:lang w:eastAsia="es-PE"/>
-        </w:rPr>
-        <w:t>).</w:t>
+      <w:r>
+        <w:rPr>
+          <w:rFonts w:ascii="Times New Roman" w:eastAsia="Times New Roman" w:hAnsi="Times New Roman" w:cs="Times New Roman"/>
+          <w:lang w:eastAsia="es-PE"/>
+        </w:rPr>
+        <w:t>Backups automáticos de la BD (diarios a las 00:00 hrs).</w:t>
       </w:r>
     </w:p>
     <w:p>
@@ -2031,13 +1996,11 @@
       <w:pPr>
         <w:spacing w:before="100" w:beforeAutospacing="1" w:after="100" w:afterAutospacing="1" w:line="240" w:lineRule="auto"/>
         <w:ind w:left="708"/>
-        <w:jc w:val="left"/>
-        <w:rPr>
-          <w:rFonts w:ascii="Times New Roman" w:eastAsia="Times New Roman" w:hAnsi="Times New Roman" w:cs="Times New Roman"/>
-          <w:lang w:eastAsia="es-PE"/>
-        </w:rPr>
-      </w:pPr>
-      <w:proofErr w:type="gramStart"/>
+        <w:rPr>
+          <w:rFonts w:ascii="Times New Roman" w:eastAsia="Times New Roman" w:hAnsi="Times New Roman" w:cs="Times New Roman"/>
+          <w:lang w:eastAsia="es-PE"/>
+        </w:rPr>
+      </w:pPr>
       <w:r>
         <w:rPr>
           <w:rFonts w:ascii="Times New Roman" w:eastAsia="Times New Roman" w:hAnsi="Symbol" w:cs="Times New Roman"/>
@@ -2050,15 +2013,7 @@
           <w:rFonts w:ascii="Times New Roman" w:eastAsia="Times New Roman" w:hAnsi="Times New Roman" w:cs="Times New Roman"/>
           <w:lang w:eastAsia="es-PE"/>
         </w:rPr>
-        <w:t xml:space="preserve">  El</w:t>
-      </w:r>
-      <w:proofErr w:type="gramEnd"/>
-      <w:r>
-        <w:rPr>
-          <w:rFonts w:ascii="Times New Roman" w:eastAsia="Times New Roman" w:hAnsi="Times New Roman" w:cs="Times New Roman"/>
-          <w:lang w:eastAsia="es-PE"/>
-        </w:rPr>
-        <w:t xml:space="preserve"> presente documento será revisado y actualizado tras cada </w:t>
+        <w:t xml:space="preserve"> El presente documento será revisado y actualizado tras cada </w:t>
       </w:r>
       <w:r>
         <w:rPr>
@@ -2097,13 +2052,11 @@
       <w:pPr>
         <w:spacing w:before="100" w:beforeAutospacing="1" w:after="100" w:afterAutospacing="1" w:line="240" w:lineRule="auto"/>
         <w:ind w:left="708"/>
-        <w:jc w:val="left"/>
-        <w:rPr>
-          <w:rFonts w:ascii="Times New Roman" w:eastAsia="Times New Roman" w:hAnsi="Times New Roman" w:cs="Times New Roman"/>
-          <w:lang w:eastAsia="es-PE"/>
-        </w:rPr>
-      </w:pPr>
-      <w:proofErr w:type="gramStart"/>
+        <w:rPr>
+          <w:rFonts w:ascii="Times New Roman" w:eastAsia="Times New Roman" w:hAnsi="Times New Roman" w:cs="Times New Roman"/>
+          <w:lang w:eastAsia="es-PE"/>
+        </w:rPr>
+      </w:pPr>
       <w:r>
         <w:rPr>
           <w:rFonts w:ascii="Times New Roman" w:eastAsia="Times New Roman" w:hAnsi="Symbol" w:cs="Times New Roman"/>
@@ -2116,15 +2069,7 @@
           <w:rFonts w:ascii="Times New Roman" w:eastAsia="Times New Roman" w:hAnsi="Times New Roman" w:cs="Times New Roman"/>
           <w:lang w:eastAsia="es-PE"/>
         </w:rPr>
-        <w:t xml:space="preserve">  Se</w:t>
-      </w:r>
-      <w:proofErr w:type="gramEnd"/>
-      <w:r>
-        <w:rPr>
-          <w:rFonts w:ascii="Times New Roman" w:eastAsia="Times New Roman" w:hAnsi="Times New Roman" w:cs="Times New Roman"/>
-          <w:lang w:eastAsia="es-PE"/>
-        </w:rPr>
-        <w:t xml:space="preserve"> mantendrá un </w:t>
+        <w:t xml:space="preserve"> Se mantendrá un </w:t>
       </w:r>
       <w:proofErr w:type="spellStart"/>
       <w:r>
@@ -2165,14 +2110,24 @@
     <w:p>
       <w:pPr>
         <w:pStyle w:val="Ttulo1"/>
+        <w:rPr>
+          <w:sz w:val="24"/>
+          <w:szCs w:val="24"/>
+        </w:rPr>
       </w:pPr>
       <w:r>
         <w:rPr>
           <w:rStyle w:val="Textoennegrita"/>
+          <w:sz w:val="24"/>
+          <w:szCs w:val="24"/>
         </w:rPr>
         <w:t>SoporteBancoDeLeche@gmail.com</w:t>
       </w:r>
       <w:r>
+        <w:rPr>
+          <w:sz w:val="24"/>
+          <w:szCs w:val="24"/>
+        </w:rPr>
         <w:t xml:space="preserve"> </w:t>
       </w:r>
     </w:p>
@@ -2187,7 +2142,6 @@
     <w:p>
       <w:pPr>
         <w:spacing w:before="100" w:beforeAutospacing="1" w:after="100" w:afterAutospacing="1" w:line="240" w:lineRule="auto"/>
-        <w:jc w:val="left"/>
         <w:rPr>
           <w:rFonts w:ascii="Times New Roman" w:eastAsia="Times New Roman" w:hAnsi="Times New Roman" w:cs="Times New Roman"/>
           <w:lang w:eastAsia="es-PE"/>
@@ -2203,7 +2157,6 @@
       <w:r>
         <w:rPr>
           <w:rFonts w:ascii="Times New Roman" w:eastAsia="Times New Roman" w:hAnsi="Times New Roman" w:cs="Times New Roman"/>
-          <w:b/>
           <w:bCs/>
           <w:lang w:eastAsia="es-PE"/>
         </w:rPr>
@@ -2219,7 +2172,6 @@
       <w:r>
         <w:rPr>
           <w:rFonts w:ascii="Times New Roman" w:eastAsia="Times New Roman" w:hAnsi="Times New Roman" w:cs="Times New Roman"/>
-          <w:b/>
           <w:bCs/>
           <w:lang w:eastAsia="es-PE"/>
         </w:rPr>
@@ -2236,7 +2188,6 @@
     <w:p>
       <w:pPr>
         <w:spacing w:before="100" w:beforeAutospacing="1" w:after="100" w:afterAutospacing="1" w:line="240" w:lineRule="auto"/>
-        <w:jc w:val="left"/>
         <w:rPr>
           <w:rFonts w:ascii="Times New Roman" w:eastAsia="Times New Roman" w:hAnsi="Times New Roman" w:cs="Times New Roman"/>
           <w:lang w:eastAsia="es-PE"/>
@@ -2252,7 +2203,6 @@
       <w:r>
         <w:rPr>
           <w:rFonts w:ascii="Times New Roman" w:eastAsia="Times New Roman" w:hAnsi="Times New Roman" w:cs="Times New Roman"/>
-          <w:b/>
           <w:bCs/>
           <w:lang w:eastAsia="es-PE"/>
         </w:rPr>
@@ -2268,7 +2218,6 @@
       <w:r>
         <w:rPr>
           <w:rFonts w:ascii="Times New Roman" w:eastAsia="Times New Roman" w:hAnsi="Times New Roman" w:cs="Times New Roman"/>
-          <w:b/>
           <w:bCs/>
           <w:lang w:eastAsia="es-PE"/>
         </w:rPr>
@@ -2288,8 +2237,6 @@
           <w:lang w:eastAsia="es-PE"/>
         </w:rPr>
       </w:pPr>
-      <w:bookmarkStart w:id="0" w:name="_GoBack"/>
-      <w:bookmarkEnd w:id="0"/>
     </w:p>
     <w:sectPr>
       <w:pgSz w:w="11906" w:h="16838"/>

</xml_diff>